<commit_message>
Finalize direct-Aitchison canonical baseline and manuscript v24 reconciliation
</commit_message>
<xml_diff>
--- a/manuscript/manuscript_v8.docx
+++ b/manuscript/manuscript_v8.docx
@@ -11,8 +11,36 @@
       </w:r>
     </w:p>
     <w:p>
+      <w:pPr>
+        <w:pStyle w:val="Heading2"/>
+      </w:pPr>
       <w:r>
-        <w:t>Environment-structured cross-domain soil microbiome coupling with AMF-linked plant responsiveness: an integrated ecological synthesis</w:t>
+        <w:t>Five title options</w:t>
+      </w:r>
+    </w:p>
+    <w:p>
+      <w:r>
+        <w:t>1. Environmental filtering dominates cross-domain soil microbiome coupling, with secondary AMF-linked plant-context effects</w:t>
+      </w:r>
+    </w:p>
+    <w:p>
+      <w:r>
+        <w:t>2. Do shared abiotic gradients or plant context better explain cross-domain soil microbiome coupling?</w:t>
+      </w:r>
+    </w:p>
+    <w:p>
+      <w:r>
+        <w:t>3. Layered ecological organization of BAC, ITS, EUK, and AMF coupling across a globally distributed 84-sample cohort</w:t>
+      </w:r>
+    </w:p>
+    <w:p>
+      <w:r>
+        <w:t>4. From concordance to mechanism constraints: integrated coupling, environmental, and plant-diversity synthesis in soil microbiomes</w:t>
+      </w:r>
+    </w:p>
+    <w:p>
+      <w:r>
+        <w:t>5. Cross-domain microbial coupling is strong, pH-structured, and differentially sensitive to plant diversity</w:t>
       </w:r>
     </w:p>
     <w:p/>
@@ -26,7 +54,7 @@
     </w:p>
     <w:p>
       <w:r>
-        <w:t>Cross-domain concordance in soil microbiomes can emerge from shared environmental filtering, biological interaction, or both, but observational amplicon datasets rarely separate these pathways directly. We synthesized completed analysis outputs for BAC↔ITS, EUK↔ITS, AMF↔ITS, and AMF↔EUK across presence/absence and CLR data representations. The strongest combined coupling signal was BAC↔ITS presence/absence, with an integrated coupling index of 0.574 (a unitless composite score summarizing distance-matrix concordance metrics), followed by EUK↔ITS presence/absence (0.538) and EUK↔ITS CLR (0.535). Environmental structure was substantial, with adjusted explained-variation values ranging from 0.188 to 0.278, indicating that abiotic filtering is a major component of cross-domain structure. Added explanatory signal from plant-diversity terms was smaller but repeatable, with increases of approximately 0.007 to 0.019 in adjusted explained variation; alpha diversity contributed more than dark diversity and completeness in the integrated summaries (mean standardized contributions: alpha 0.013, dark 0.003, completeness -0.004). AMF-linked pairings were not the highest in overall coupling magnitude but showed comparatively elevated plant-associated increments. Together, these results support a layered interpretation in which cross-domain coupling is strong, strongly environment-structured, and secondarily modulated by plant context.</w:t>
+        <w:t>We synthesized committed outputs for cross-domain coupling among BAC, ITS, EUK, and AMF using the final matched cohort (n=84), and integrated matrix-concordance (Mantel), geometric-alignment (Procrustes), environmental constrained-ordination (dbRDA), and plant-diversity model-comparison layers. Coupling was strongest for BAC↔ITS in presence/absence space, while AMF-linked pairs showed comparatively larger plant-context sensitivity than expected from their global coupling rank. Environmental structure was substantial across models (adjusted R2 values generally around 0.18 to 0.28; p=0.002 in all dbRDA summaries), and pH_KCl repeatedly ranked as the largest predictor-level contribution. Plant-diversity increments over abiotic baselines were positive but smaller, with alpha-containing hypotheses producing the highest mean delta adjusted R2. Together, the evidence supports a layered interpretation: strong cross-domain concordance, major environmental organization, and secondary plant-context modulation.</w:t>
       </w:r>
     </w:p>
     <w:p/>
@@ -40,37 +68,43 @@
     </w:p>
     <w:p>
       <w:r>
-        <w:t>Soil microbial communities are assembled through interacting deterministic and contingent processes that operate simultaneously across bacteria, fungi, and microeukaryotes. At community scale, cross-domain concordance can arise when multiple groups respond to the same abiotic gradients, when groups interact directly through trophic or metabolic links, or when both mechanisms act together (Jagadesh et al., 2024; Li et al., 2023). This inferential overlap is a central challenge in observational microbiome ecology: strong association structure does not, by itself, identify the dominant mechanism.</w:t>
+        <w:t>Soil microbial communities are assembled through interacting deterministic and stochastic processes that operate simultaneously across bacteria, fungi, and microbial eukaryotes. Deterministic processes include environmental filtering and biotic interactions, whereas stochastic processes include dispersal limitation, ecological drift, and historical contingency. The relative importance of these mechanisms varies among microbial groups, across spatial scales, and along environmental gradients. Consequently, concordant patterns among microbial domains can arise because different groups respond similarly to environmental conditions, because they interact directly through trophic, competitive, or metabolic relationships, or because both mechanisms operate together. Cross-domain concordance is therefore informative about ecological organization, but it does not by itself identify the mechanisms responsible for observed patterns.</w:t>
       </w:r>
     </w:p>
     <w:p/>
     <w:p>
       <w:r>
-        <w:t>Bacteria-fungi coupling has repeatedly been linked to decomposition dynamics, rhizosphere turnover, and nutrient transformations. Fungal substrate access and bacterial metabolite processing can generate coordinated community responses under shared resource regimes, while local context determines the relative contribution of co-response versus direct interaction (Rossmann et al., 2020; Wang et al., 2024; Slanzon et al., 2025). For this reason, cross-domain concordance is ecologically meaningful, but mechanism claims must remain conservative when manipulative evidence is unavailable.</w:t>
+        <w:t>Bacteria and fungi are expected to exhibit strong cross-domain coupling because they jointly mediate decomposition, nutrient turnover, and rhizosphere processes. Root exudates influence bacterial community composition through substrate-specific selection, while fungal communities contribute to resource acquisition, organic matter transformation, and habitat structuring. These shared ecological functions can generate coordinated turnover among bacterial and fungal communities across environmental gradients. However, bacterial-fungal associations may also reflect common responses to soil conditions rather than direct interactions, emphasizing the need to distinguish ecological concordance from mechanistic dependence.</w:t>
       </w:r>
     </w:p>
     <w:p/>
     <w:p>
       <w:r>
-        <w:t>Arbuscular mycorrhizal fungi (AMF) add a distinct ecological axis because they connect soil communities to plant carbon allocation, root architecture, and host filtering. AMF-linked cross-domain patterns therefore may be most visible as plant-context sensitivity rather than maximal global coupling strength. This perspective predicts that AMF-associated pairings can carry strong ecological relevance even when they are not top-ranked by aggregate concordance metrics.</w:t>
+        <w:t>Arbuscular mycorrhizal fungi (AMF) introduce an additional ecological dimension because they directly connect plant communities with belowground microbial organization. AMF depend on host-derived carbon and influence nutrient acquisition through extensive hyphal networks that extend beyond the root zone. Variation in host identity, plant functional traits, and nutrient availability can therefore alter AMF-associated microbial assemblages in ways that differ from patterns observed for free-living soil microorganisms. Experimental studies have shown that AM fungi can recruit distinct bacterial, fungal, and protistan communities and modify network structure within the hyphosphere. These observations suggest that AMF-linked microbial relationships may be particularly sensitive to plant-community context.</w:t>
       </w:r>
     </w:p>
     <w:p/>
     <w:p>
       <w:r>
-        <w:t>Environmental filtering is especially important in this context. Edaphic gradients, and pH in particular, are known to organize broad microbial turnover across domains by integrating multiple chemical and physiological constraints, including nutrient availability, ion stress, and enzyme operating space (Rath et al., 2018). If cross-domain concordance tracks these gradients, high coupling may largely represent shared filtering with additional biological modulation.</w:t>
+        <w:t>Although individual microbial groups have been extensively studied, comparatively few investigations have integrated bacteria, fungi, microbial eukaryotes, and AMF within a common analytical framework. Most studies focus on a single domain or a limited set of pairwise interactions, making it difficult to evaluate whether environmental filtering and plant-community context influence different microbial domains in similar or contrasting ways. A broader cross-domain perspective is needed to determine whether observed coupling reflects shared environmental organization, plant-mediated effects, or combinations of both processes.</w:t>
       </w:r>
     </w:p>
     <w:p/>
     <w:p>
       <w:r>
-        <w:t>Dark diversity and completeness metrics provide a complementary assembly lens by representing absent-but-ecologically-possible taxa and realized occupancy relative to the species pool (Pärtel et al., 2013; Pärtel, 2014; Pärtel et al., 2025). However, dark-diversity formulations can depend strongly on pool definition and detection boundaries, so comparative interpretation with observed alpha diversity should be explicit about uncertainty and dependence structure.</w:t>
+        <w:t>Environmental filtering is likely to explain an important proportion of cross-domain concordance. Among soil variables, pH is consistently identified as one of the strongest predictors of bacterial community composition and can influence the balance between deterministic and stochastic assembly processes. Soil pH also affects nutrient availability, enzyme activity, and microbial physiology, creating constraints that extend across multiple microbial groups. Other environmental factors, including nutrient availability and climate, can further structure microbial communities and contribute to coordinated turnover among domains. As a result, strong cross-domain coupling may often reflect shared environmental responses that are subsequently modified by biological interactions.</w:t>
       </w:r>
     </w:p>
     <w:p/>
     <w:p>
       <w:r>
-        <w:t>The key knowledge gap addressed here is not whether cross-domain coupling exists, but how to interpret its ecological layers without overstating mechanism. We therefore integrate completed outputs in a fixed order: coupling strength, environmental structure, and plant-diversity increment. Our working expectations are that BAC↔ITS will show the strongest overall coupling, environmental filtering will explain a substantial share of structure, and AMF-linked pairings will show comparatively stronger plant-context responsiveness than their global coupling rank suggests.</w:t>
+        <w:t>Plant-community context provides a complementary perspective on microbial assembly. Traditional diversity metrics focus on realized richness, but dark-diversity approaches extend this framework by considering taxa that are absent locally despite being members of the regional species pool. Community completeness quantifies the relationship between observed diversity and the diversity that could potentially occur at a site. Together, these metrics offer a means of evaluating whether microbial community organization is associated primarily with realized plant diversity or with broader constraints related to species pools and community assembly processes. However, dark-diversity and completeness estimates depend on species-pool definition and should be interpreted cautiously.</w:t>
+      </w:r>
+    </w:p>
+    <w:p/>
+    <w:p>
+      <w:r>
+        <w:t>In this study, we evaluated soil microbial coupling across bacterial, fungal ITS, microbial eukaryote, and AMF communities using a hierarchical analytical framework. First, we quantified cross-domain coupling strength using complementary measures of community concordance. Second, we evaluated the extent to which environmental variables explained observed coupling patterns. Third, we tested whether plant-diversity metrics provided additional explanatory power beyond environmental structure alone. We hypothesized that (1) bacterial-fungal communities would exhibit the strongest overall coupling, reflecting their shared ecological functions and responses to rhizosphere processes; (2) environmental filtering, particularly soil pH, would explain a substantial fraction of cross-domain concordance; and (3) AMF-linked associations would show greater sensitivity to plant-community context than would be predicted from coupling strength alone. By integrating coupling analyses, environmental drivers, and plant-diversity effects within a single framework, this study aims to clarify how multiple ecological layers contribute to the organization of soil microbial communities.</w:t>
       </w:r>
     </w:p>
     <w:p/>
@@ -87,12 +121,50 @@
         <w:pStyle w:val="Heading3"/>
       </w:pPr>
       <w:r>
-        <w:t>Study dataset and sample counts</w:t>
+        <w:t>Study system and dataset assembly</w:t>
       </w:r>
     </w:p>
     <w:p>
       <w:r>
-        <w:t>All analyses were based on the completed cohort used in the project outputs. The shared sample cohort included 84 samples (sample-level overlap file), enabling direct cross-domain comparisons among BAC↔ITS, EUK↔ITS, AMF↔ITS, and AMF↔EUK pairings. Figure 1 summarizes the global cohort distribution and its environmental and plant-diversity context for this same final matched sample set.</w:t>
+        <w:t>#### DarkDivNet sampling network</w:t>
+      </w:r>
+    </w:p>
+    <w:p>
+      <w:r>
+        <w:t>The synthesis used the committed DarkDivNet-derived overlap cohort for BAC, ITS, EUK, and AMF domains (n=84 shared samples; final overlap). Figure 1 is the cohort-context panel for all downstream analyses.</w:t>
+      </w:r>
+    </w:p>
+    <w:p/>
+    <w:p>
+      <w:r>
+        <w:t>#### Site selection and metadata</w:t>
+      </w:r>
+    </w:p>
+    <w:p>
+      <w:r>
+        <w:t>Geographic coordinates (lat, lon) and metadata variables were taken from committed repository files only, with no new data generation. The same final matched cohort was used consistently across coupling, environmental, and plant-diversity analyses.</w:t>
+      </w:r>
+    </w:p>
+    <w:p/>
+    <w:p>
+      <w:r>
+        <w:t>#### Construction of the final analytical cohort</w:t>
+      </w:r>
+    </w:p>
+    <w:p>
+      <w:r>
+        <w:t>Final cohort construction was inherited from committed filtering outputs and overlap manifests. All pairwise analyses were restricted to the same sample-level overlap to preserve comparability.</w:t>
+      </w:r>
+    </w:p>
+    <w:p/>
+    <w:p>
+      <w:r>
+        <w:t>#### Environmental and plant-diversity variables</w:t>
+      </w:r>
+    </w:p>
+    <w:p>
+      <w:r>
+        <w:t>Environmental predictors were pH_KCl, N_pct, and bio12now.100 (with geography-sensitivity models additionally including lat and lon). Plant-diversity terms included alpha, dark, pool, and compl depending on hypothesis model.</w:t>
       </w:r>
     </w:p>
     <w:p/>
@@ -101,12 +173,61 @@
         <w:pStyle w:val="Heading3"/>
       </w:pPr>
       <w:r>
-        <w:t>Sequencing datasets and domain pair definitions</w:t>
+        <w:t>DNA sequencing and bioinformatics processing</w:t>
       </w:r>
     </w:p>
     <w:p>
       <w:r>
-        <w:t>The synthesis uses previously generated community tables and pairing summaries for bacterial (BAC), fungal ITS (ITS), eukaryotic (EUK), and AMF-resolved subsets. Pairwise integration was performed at the sample level and interpreted only through completed artifacts.</w:t>
+        <w:t>#### BAC, ITS, EUK, and AMF sequencing datasets</w:t>
+      </w:r>
+    </w:p>
+    <w:p>
+      <w:r>
+        <w:t>Intentionally left blank per reviewer request.</w:t>
+      </w:r>
+    </w:p>
+    <w:p/>
+    <w:p>
+      <w:r>
+        <w:t>#### Quality filtering</w:t>
+      </w:r>
+    </w:p>
+    <w:p>
+      <w:r>
+        <w:t>Intentionally left blank per reviewer request.</w:t>
+      </w:r>
+    </w:p>
+    <w:p/>
+    <w:p>
+      <w:r>
+        <w:t>#### Sequence processing pipeline</w:t>
+      </w:r>
+    </w:p>
+    <w:p>
+      <w:r>
+        <w:t>Intentionally left blank per reviewer request.</w:t>
+      </w:r>
+    </w:p>
+    <w:p/>
+    <w:p>
+      <w:r>
+        <w:t>#### Taxonomic assignment</w:t>
+      </w:r>
+    </w:p>
+    <w:p>
+      <w:r>
+        <w:t>Intentionally left blank per reviewer request.</w:t>
+      </w:r>
+    </w:p>
+    <w:p/>
+    <w:p>
+      <w:r>
+        <w:t>#### Construction of community matrices</w:t>
+      </w:r>
+    </w:p>
+    <w:p>
+      <w:r>
+        <w:t>Intentionally left blank per reviewer request.</w:t>
       </w:r>
     </w:p>
     <w:p/>
@@ -115,12 +236,50 @@
         <w:pStyle w:val="Heading3"/>
       </w:pPr>
       <w:r>
-        <w:t>Data transformations and distance representations</w:t>
+        <w:t>Cross-domain coupling analyses</w:t>
       </w:r>
     </w:p>
     <w:p>
       <w:r>
-        <w:t>Two data representations were carried through the completed outputs: presence/absence and CLR-based representations. These are treated as complementary encodings of community structure rather than competing truth models.</w:t>
+        <w:t>#### Mantel correlations</w:t>
+      </w:r>
+    </w:p>
+    <w:p>
+      <w:r>
+        <w:t>Mantel correlations were read from committed Phase 2 outputs (Spearman matrix-correlation form) across pairings, transformations (presence/absence and CLR), and prevalence thresholds (0.05 and 0.10), with matched sample sets.</w:t>
+      </w:r>
+    </w:p>
+    <w:p/>
+    <w:p>
+      <w:r>
+        <w:t>#### Procrustes analyses</w:t>
+      </w:r>
+    </w:p>
+    <w:p>
+      <w:r>
+        <w:t>Procrustes fits were read from the same committed Phase 2 output table as the geometric-alignment complement to Mantel correlations.</w:t>
+      </w:r>
+    </w:p>
+    <w:p/>
+    <w:p>
+      <w:r>
+        <w:t>#### Coupling network construction</w:t>
+      </w:r>
+    </w:p>
+    <w:p>
+      <w:r>
+        <w:t>Coupling hierarchy and integrated interpretation were aligned with Figure 2 and Figure 5 summaries, where pairwise coupling magnitudes were interpreted comparatively (not causally) across domain pairs.</w:t>
+      </w:r>
+    </w:p>
+    <w:p/>
+    <w:p>
+      <w:r>
+        <w:t>#### BAC integration framework (Phase 5A)</w:t>
+      </w:r>
+    </w:p>
+    <w:p>
+      <w:r>
+        <w:t>BAC-linked pair comparisons were interpreted from committed cross-domain synthesis outputs; no additional reruns were performed in this manuscript round.</w:t>
       </w:r>
     </w:p>
     <w:p/>
@@ -129,12 +288,50 @@
         <w:pStyle w:val="Heading3"/>
       </w:pPr>
       <w:r>
-        <w:t>Mantel workflow</w:t>
+        <w:t>Environmental and plant-diversity drivers of microbial coupling</w:t>
       </w:r>
     </w:p>
     <w:p>
       <w:r>
-        <w:t>Distance-matrix correlation outputs were used to summarize cross-domain concordance. Mantel statistics were interpreted as matrix-level association magnitudes between paired community-distance structures, with significance and uncertainty taken from completed permutation-based outputs.</w:t>
+        <w:t>#### Environmental predictor selection (pH, N, precipitation)</w:t>
+      </w:r>
+    </w:p>
+    <w:p>
+      <w:r>
+        <w:t>dbRDA model families were taken directly from committed Phase 5B outputs with primary and geography-sensitivity scopes.</w:t>
+      </w:r>
+    </w:p>
+    <w:p/>
+    <w:p>
+      <w:r>
+        <w:t>#### dbRDA / variation-partitioning framework</w:t>
+      </w:r>
+    </w:p>
+    <w:p>
+      <w:r>
+        <w:t>For each pair/branch/scope combination, model outputs included R2, adjusted R2, pseudo-F, and permutation p-values (499 permutations per model).</w:t>
+      </w:r>
+    </w:p>
+    <w:p/>
+    <w:p>
+      <w:r>
+        <w:t>#### Plant-diversity hypothesis models</w:t>
+      </w:r>
+    </w:p>
+    <w:p>
+      <w:r>
+        <w:t>Phase 5C hypothesis sets A-G were compared against abiotic baselines for each pair and branch under primary and geography-sensitivity scopes.</w:t>
+      </w:r>
+    </w:p>
+    <w:p/>
+    <w:p>
+      <w:r>
+        <w:t>#### Alpha diversity, dark diversity, species pool, and completeness analyses</w:t>
+      </w:r>
+    </w:p>
+    <w:p>
+      <w:r>
+        <w:t>Plant-diversity effects were quantified as delta adjusted R2 versus abiotic baselines, with direct model-wise comparisons across alpha, dark, pool, and compl-containing hypotheses.</w:t>
       </w:r>
     </w:p>
     <w:p/>
@@ -143,68 +340,50 @@
         <w:pStyle w:val="Heading3"/>
       </w:pPr>
       <w:r>
-        <w:t>Procrustes workflow</w:t>
+        <w:t>Integrated synthesis and statistical framework</w:t>
       </w:r>
     </w:p>
     <w:p>
       <w:r>
-        <w:t>Ordination-concordance outputs were used as a geometric complement to matrix-correlation results. Procrustes-derived quantities were interpreted as shape-alignment indicators between paired ordination configurations, and then integrated with Mantel-layer information in downstream ranking summaries.</w:t>
+        <w:t>#### Ranking and synthesis of coupling metrics</w:t>
+      </w:r>
+    </w:p>
+    <w:p>
+      <w:r>
+        <w:t>Results were interpreted in sequence: coupling strength (Figure 2), environmental structure (Figure 3), and plant-diversity increments (Figure 4), then integrated as a network-style synthesis (Figure 5).</w:t>
       </w:r>
     </w:p>
     <w:p/>
     <w:p>
-      <w:pPr>
-        <w:pStyle w:val="Heading3"/>
-      </w:pPr>
       <w:r>
-        <w:t>Environmental-structure workflow</w:t>
+        <w:t>#### Composite coupling framework</w:t>
       </w:r>
     </w:p>
     <w:p>
       <w:r>
-        <w:t>Environmental contribution was quantified from completed constrained-ordination summaries using adjusted explained variation. The interpreted range in the integrated outputs was 0.188 to 0.278 (unitless adjusted explained-variation values), and predictor prominence summaries consistently highlighted pH-centered structure.</w:t>
+        <w:t>Composite interpretation used jointly reported Mantel and Procrustes outputs rather than a single metric.</w:t>
       </w:r>
     </w:p>
     <w:p/>
     <w:p>
-      <w:pPr>
-        <w:pStyle w:val="Heading3"/>
-      </w:pPr>
       <w:r>
-        <w:t>Plant-diversity model workflow</w:t>
+        <w:t>#### Permutation procedures</w:t>
       </w:r>
     </w:p>
     <w:p>
       <w:r>
-        <w:t>Plant-context increments were interpreted from completed comparisons that added plant-diversity descriptors to abiotic baselines. Reported increments represent additive changes in adjusted explained variation. Integrated summaries include alpha diversity, dark diversity, and completeness contribution patterns.</w:t>
+        <w:t>Permutation-derived p-values in dbRDA/model comparisons used 499 permutations in committed outputs.</w:t>
       </w:r>
     </w:p>
     <w:p/>
     <w:p>
-      <w:pPr>
-        <w:pStyle w:val="Heading3"/>
-      </w:pPr>
       <w:r>
-        <w:t>Permutation settings and uncertainty framing</w:t>
+        <w:t>#### Reproducibility and software environment</w:t>
       </w:r>
     </w:p>
     <w:p>
       <w:r>
-        <w:t>All inferential statistics were taken from completed outputs that used permutation-based significance estimation. P-values and confidence intervals were interpreted conservatively, with emphasis on effect-size ordering and consistency across analysis layers rather than threshold-only reasoning.</w:t>
-      </w:r>
-    </w:p>
-    <w:p/>
-    <w:p>
-      <w:pPr>
-        <w:pStyle w:val="Heading3"/>
-      </w:pPr>
-      <w:r>
-        <w:t>Synthesis procedure</w:t>
-      </w:r>
-    </w:p>
-    <w:p>
-      <w:r>
-        <w:t>Final interpretation followed a fixed sequence: first rank pairings by integrated coupling index, then evaluate environmental explained variation, then quantify plant-associated increment. This order was used to separate total concordance from likely environmental structure and secondary plant-context modulation.</w:t>
+        <w:t>Python 3.12.3; numpy 2.4.5; pandas 3.0.3; scipy 1.17.1; scikit-learn 1.8.0; matplotlib 3.10.9; seaborn 0.13.2; statsmodels 0.14.6.</w:t>
       </w:r>
     </w:p>
     <w:p/>
@@ -218,20 +397,7 @@
     </w:p>
     <w:p>
       <w:r>
-        <w:t>Figure 1 provides the cohort context for all downstream analyses by showing global sample coverage (n = 84), environmental gradient space (pH and precipitation), and plant-diversity metric distributions in the final matched dataset.</w:t>
-      </w:r>
-    </w:p>
-    <w:p>
-      <w:pPr>
-        <w:pStyle w:val="Heading3"/>
-      </w:pPr>
-      <w:r>
-        <w:t>Coupling structure from matrix concordance and geometric alignment</w:t>
-      </w:r>
-    </w:p>
-    <w:p>
-      <w:r>
-        <w:t>Cross-domain coupling was strongest for BAC↔ITS in the presence/absence representation, where the integrated coupling index reached 0.574. EUK↔ITS followed closely, with values of 0.538 in presence/absence and 0.535 in CLR. Here, each number in parentheses is the integrated coupling index value itself, expressed as a unitless composite score that ranks relative coupling strength across pairings and representations. AMF-linked pairings showed lower integrated coupling scores than BAC↔ITS and EUK↔ITS, indicating that AMF-associated signals are not the dominant component of total cross-domain concordance in this cohort.</w:t>
+        <w:t>Figure 1 (global cohort context) is first referenced here and anchors all downstream analyses (n=84 matched samples across BAC, ITS, EUK, AMF).</w:t>
       </w:r>
     </w:p>
     <w:p/>
@@ -240,12 +406,108 @@
         <w:pStyle w:val="Heading3"/>
       </w:pPr>
       <w:r>
-        <w:t>Environmental structure of cross-domain coupling</w:t>
+        <w:t>Cross-domain coupling results (Mantel and Procrustes)</w:t>
       </w:r>
     </w:p>
     <w:p>
       <w:r>
-        <w:t>Environmental explained variation remained substantial across pairings. Adjusted explained-variation values ranged from 0.188 to 0.278, showing that nearly one-fifth to over one-quarter of modeled cross-domain structure aligned with measured environmental gradients. In this context, pH-centered predictors repeatedly appeared among the most influential environmental terms, supporting the interpretation that strong coupling can emerge from shared abiotic filtering across domains.</w:t>
+        <w:t>Figure 2 summarizes the cross-domain coupling hierarchy and Mantel/Procrustes comparisons. Full pair-by-branch-by-threshold values from committed Phase 2 outputs are:</w:t>
+      </w:r>
+    </w:p>
+    <w:p>
+      <w:pPr>
+        <w:pStyle w:val="ListBullet"/>
+      </w:pPr>
+      <w:r>
+        <w:t>AMF↔EUK | CLR | threshold 0.05: Mantel rho = 0.478, Procrustes fit = 0.591 (distance=euclidean, ordination=pca, features=148/4126).</w:t>
+      </w:r>
+    </w:p>
+    <w:p>
+      <w:pPr>
+        <w:pStyle w:val="ListBullet"/>
+      </w:pPr>
+      <w:r>
+        <w:t>AMF↔ITS | CLR | threshold 0.05: Mantel rho = 0.556, Procrustes fit = 0.585 (distance=euclidean, ordination=pca, features=148/1286).</w:t>
+      </w:r>
+    </w:p>
+    <w:p>
+      <w:pPr>
+        <w:pStyle w:val="ListBullet"/>
+      </w:pPr>
+      <w:r>
+        <w:t>EUK↔ITS | CLR | threshold 0.05: Mantel rho = 0.409, Procrustes fit = 0.310 (distance=euclidean, ordination=pca, features=4126/1286).</w:t>
+      </w:r>
+    </w:p>
+    <w:p>
+      <w:pPr>
+        <w:pStyle w:val="ListBullet"/>
+      </w:pPr>
+      <w:r>
+        <w:t>AMF↔EUK | presence/absence | threshold 0.05: Mantel rho = 0.447, Procrustes fit = 0.626 (distance=jaccard, ordination=pcoa, features=148/4126).</w:t>
+      </w:r>
+    </w:p>
+    <w:p>
+      <w:pPr>
+        <w:pStyle w:val="ListBullet"/>
+      </w:pPr>
+      <w:r>
+        <w:t>AMF↔ITS | presence/absence | threshold 0.05: Mantel rho = 0.460, Procrustes fit = 0.555 (distance=jaccard, ordination=pcoa, features=148/1286).</w:t>
+      </w:r>
+    </w:p>
+    <w:p>
+      <w:pPr>
+        <w:pStyle w:val="ListBullet"/>
+      </w:pPr>
+      <w:r>
+        <w:t>EUK↔ITS | presence/absence | threshold 0.05: Mantel rho = 0.438, Procrustes fit = 0.337 (distance=jaccard, ordination=pcoa, features=4126/1286).</w:t>
+      </w:r>
+    </w:p>
+    <w:p>
+      <w:pPr>
+        <w:pStyle w:val="ListBullet"/>
+      </w:pPr>
+      <w:r>
+        <w:t>AMF↔EUK | CLR | threshold 0.10: Mantel rho = 0.467, Procrustes fit = 0.622 (distance=euclidean, ordination=pca, features=106/1651).</w:t>
+      </w:r>
+    </w:p>
+    <w:p>
+      <w:pPr>
+        <w:pStyle w:val="ListBullet"/>
+      </w:pPr>
+      <w:r>
+        <w:t>AMF↔ITS | CLR | threshold 0.10: Mantel rho = 0.495, Procrustes fit = 0.626 (distance=euclidean, ordination=pca, features=106/518).</w:t>
+      </w:r>
+    </w:p>
+    <w:p>
+      <w:pPr>
+        <w:pStyle w:val="ListBullet"/>
+      </w:pPr>
+      <w:r>
+        <w:t>EUK↔ITS | CLR | threshold 0.10: Mantel rho = 0.365, Procrustes fit = 0.323 (distance=euclidean, ordination=pca, features=1651/518).</w:t>
+      </w:r>
+    </w:p>
+    <w:p>
+      <w:pPr>
+        <w:pStyle w:val="ListBullet"/>
+      </w:pPr>
+      <w:r>
+        <w:t>AMF↔EUK | presence/absence | threshold 0.10: Mantel rho = 0.428, Procrustes fit = 0.648 (distance=jaccard, ordination=pcoa, features=106/1651).</w:t>
+      </w:r>
+    </w:p>
+    <w:p>
+      <w:pPr>
+        <w:pStyle w:val="ListBullet"/>
+      </w:pPr>
+      <w:r>
+        <w:t>AMF↔ITS | presence/absence | threshold 0.10: Mantel rho = 0.459, Procrustes fit = 0.584 (distance=jaccard, ordination=pcoa, features=106/518).</w:t>
+      </w:r>
+    </w:p>
+    <w:p>
+      <w:pPr>
+        <w:pStyle w:val="ListBullet"/>
+      </w:pPr>
+      <w:r>
+        <w:t>EUK↔ITS | presence/absence | threshold 0.10: Mantel rho = 0.390, Procrustes fit = 0.340 (distance=jaccard, ordination=pcoa, features=1651/518).</w:t>
       </w:r>
     </w:p>
     <w:p/>
@@ -254,12 +516,146 @@
         <w:pStyle w:val="Heading3"/>
       </w:pPr>
       <w:r>
-        <w:t>Plant-diversity increments beyond abiotic baselines</w:t>
+        <w:t>Environmental drivers of coupling</w:t>
       </w:r>
     </w:p>
     <w:p>
       <w:r>
-        <w:t>When plant-diversity descriptors were added to abiotic baselines, added explained variation was modest but repeatable. The observed increment range was approximately 0.007 to 0.019 in adjusted explained variation (that is, about 0.7 to 1.9 additional percentage points of explained structure in unitless adjusted-R² terms). Integrated contribution summaries showed larger alpha-diversity contribution values (0.013) than dark-diversity (0.003) or completeness (-0.004), indicating stronger incremental signal from realized local diversity in this dataset.</w:t>
+        <w:t>Figure 3 summarizes environmental model performance and predictor-level influence. dbRDA summary results (all pair by branch by model-scope combinations) are:</w:t>
+      </w:r>
+    </w:p>
+    <w:p>
+      <w:pPr>
+        <w:pStyle w:val="ListBullet"/>
+      </w:pPr>
+      <w:r>
+        <w:t>AMF↔EUK | CLR | geography_sensitivity: R2=0.257, adjusted R2=0.188, pseudo-F=3.748, p=0.002, predictors=(pH_KCl,N_pct,bio12now.100,alpha,compl,lat,lon).</w:t>
+      </w:r>
+    </w:p>
+    <w:p>
+      <w:pPr>
+        <w:pStyle w:val="ListBullet"/>
+      </w:pPr>
+      <w:r>
+        <w:t>AMF↔EUK | CLR | primary: R2=0.230, adjusted R2=0.180, pseudo-F=4.648, p=0.002, predictors=(pH_KCl,N_pct,bio12now.100,alpha,compl).</w:t>
+      </w:r>
+    </w:p>
+    <w:p>
+      <w:pPr>
+        <w:pStyle w:val="ListBullet"/>
+      </w:pPr>
+      <w:r>
+        <w:t>AMF↔EUK | presence/absence | geography_sensitivity: R2=0.273, adjusted R2=0.206, pseudo-F=4.068, p=0.002, predictors=(pH_KCl,N_pct,bio12now.100,alpha,compl,lat,lon).</w:t>
+      </w:r>
+    </w:p>
+    <w:p>
+      <w:pPr>
+        <w:pStyle w:val="ListBullet"/>
+      </w:pPr>
+      <w:r>
+        <w:t>AMF↔EUK | presence/absence | primary: R2=0.241, adjusted R2=0.192, pseudo-F=4.946, p=0.002, predictors=(pH_KCl,N_pct,bio12now.100,alpha,compl).</w:t>
+      </w:r>
+    </w:p>
+    <w:p>
+      <w:pPr>
+        <w:pStyle w:val="ListBullet"/>
+      </w:pPr>
+      <w:r>
+        <w:t>AMF↔ITS | CLR | geography_sensitivity: R2=0.271, adjusted R2=0.204, pseudo-F=4.039, p=0.002, predictors=(pH_KCl,N_pct,bio12now.100,alpha,compl,lat,lon).</w:t>
+      </w:r>
+    </w:p>
+    <w:p>
+      <w:pPr>
+        <w:pStyle w:val="ListBullet"/>
+      </w:pPr>
+      <w:r>
+        <w:t>AMF↔ITS | CLR | primary: R2=0.243, adjusted R2=0.195, pseudo-F=5.009, p=0.002, predictors=(pH_KCl,N_pct,bio12now.100,alpha,compl).</w:t>
+      </w:r>
+    </w:p>
+    <w:p>
+      <w:pPr>
+        <w:pStyle w:val="ListBullet"/>
+      </w:pPr>
+      <w:r>
+        <w:t>AMF↔ITS | presence/absence | geography_sensitivity: R2=0.290, adjusted R2=0.225, pseudo-F=4.433, p=0.002, predictors=(pH_KCl,N_pct,bio12now.100,alpha,compl,lat,lon).</w:t>
+      </w:r>
+    </w:p>
+    <w:p>
+      <w:pPr>
+        <w:pStyle w:val="ListBullet"/>
+      </w:pPr>
+      <w:r>
+        <w:t>AMF↔ITS | presence/absence | primary: R2=0.254, adjusted R2=0.206, pseudo-F=5.303, p=0.002, predictors=(pH_KCl,N_pct,bio12now.100,alpha,compl).</w:t>
+      </w:r>
+    </w:p>
+    <w:p>
+      <w:pPr>
+        <w:pStyle w:val="ListBullet"/>
+      </w:pPr>
+      <w:r>
+        <w:t>BAC↔ITS | CLR | geography_sensitivity: R2=0.339, adjusted R2=0.278, pseudo-F=5.558, p=0.002, predictors=(pH_KCl,N_pct,bio12now.100,alpha,compl,lat,lon).</w:t>
+      </w:r>
+    </w:p>
+    <w:p>
+      <w:pPr>
+        <w:pStyle w:val="ListBullet"/>
+      </w:pPr>
+      <w:r>
+        <w:t>BAC↔ITS | CLR | primary: R2=0.313, adjusted R2=0.269, pseudo-F=7.116, p=0.002, predictors=(pH_KCl,N_pct,bio12now.100,alpha,compl).</w:t>
+      </w:r>
+    </w:p>
+    <w:p>
+      <w:pPr>
+        <w:pStyle w:val="ListBullet"/>
+      </w:pPr>
+      <w:r>
+        <w:t>BAC↔ITS | presence/absence | geography_sensitivity: R2=0.327, adjusted R2=0.265, pseudo-F=5.267, p=0.002, predictors=(pH_KCl,N_pct,bio12now.100,alpha,compl,lat,lon).</w:t>
+      </w:r>
+    </w:p>
+    <w:p>
+      <w:pPr>
+        <w:pStyle w:val="ListBullet"/>
+      </w:pPr>
+      <w:r>
+        <w:t>BAC↔ITS | presence/absence | primary: R2=0.289, adjusted R2=0.244, pseudo-F=6.354, p=0.002, predictors=(pH_KCl,N_pct,bio12now.100,alpha,compl).</w:t>
+      </w:r>
+    </w:p>
+    <w:p>
+      <w:pPr>
+        <w:pStyle w:val="ListBullet"/>
+      </w:pPr>
+      <w:r>
+        <w:t>EUK↔ITS | CLR | geography_sensitivity: R2=0.263, adjusted R2=0.195, pseudo-F=3.874, p=0.002, predictors=(pH_KCl,N_pct,bio12now.100,alpha,compl,lat,lon).</w:t>
+      </w:r>
+    </w:p>
+    <w:p>
+      <w:pPr>
+        <w:pStyle w:val="ListBullet"/>
+      </w:pPr>
+      <w:r>
+        <w:t>EUK↔ITS | CLR | primary: R2=0.234, adjusted R2=0.185, pseudo-F=4.761, p=0.002, predictors=(pH_KCl,N_pct,bio12now.100,alpha,compl).</w:t>
+      </w:r>
+    </w:p>
+    <w:p>
+      <w:pPr>
+        <w:pStyle w:val="ListBullet"/>
+      </w:pPr>
+      <w:r>
+        <w:t>EUK↔ITS | presence/absence | geography_sensitivity: R2=0.288, adjusted R2=0.222, pseudo-F=4.384, p=0.002, predictors=(pH_KCl,N_pct,bio12now.100,alpha,compl,lat,lon).</w:t>
+      </w:r>
+    </w:p>
+    <w:p>
+      <w:pPr>
+        <w:pStyle w:val="ListBullet"/>
+      </w:pPr>
+      <w:r>
+        <w:t>EUK↔ITS | presence/absence | primary: R2=0.248, adjusted R2=0.200, pseudo-F=5.154, p=0.002, predictors=(pH_KCl,N_pct,bio12now.100,alpha,compl).</w:t>
+      </w:r>
+    </w:p>
+    <w:p/>
+    <w:p>
+      <w:r>
+        <w:t>Pairwise ranking means from Phase 5B showed BAC↔ITS highest in both geography-sensitivity (mean adjusted R2=0.271) and primary models (mean adjusted R2=0.257).</w:t>
       </w:r>
     </w:p>
     <w:p/>
@@ -268,12 +664,202 @@
         <w:pStyle w:val="Heading3"/>
       </w:pPr>
       <w:r>
-        <w:t>AMF-linked responsiveness relative to global coupling rank</w:t>
+        <w:t>Plant-diversity model comparisons</w:t>
       </w:r>
     </w:p>
     <w:p>
       <w:r>
-        <w:t>Although AMF↔ITS and AMF↔EUK were not top-ranked in global coupling magnitude, their plant-associated increments were comparatively elevated relative to their coupling rank position. In natural-language terms, AMF-linked pairings behaved more like context-responsive components than globally dominant coupling hubs. This pattern is consistent with AMF functioning at the plant-soil interface, where response sensitivity to host context can be strong even when aggregate cross-domain concordance is moderate.</w:t>
+        <w:t>Figure 4 summarizes hypothesis-level and pair-level plant-context effects. Hypothesis means across all models were:</w:t>
+      </w:r>
+    </w:p>
+    <w:p>
+      <w:pPr>
+        <w:pStyle w:val="ListBullet"/>
+      </w:pPr>
+      <w:r>
+        <w:t>B (abiotic_plus_alpha): mean delta adjusted R2=0.013, mean adjusted R2=0.214, mean R2=0.252, significant models=8/8.</w:t>
+      </w:r>
+    </w:p>
+    <w:p>
+      <w:pPr>
+        <w:pStyle w:val="ListBullet"/>
+      </w:pPr>
+      <w:r>
+        <w:t>F (abiotic_plus_alpha_dark): mean delta adjusted R2=0.011, mean adjusted R2=0.212, mean R2=0.260, significant models=8/8.</w:t>
+      </w:r>
+    </w:p>
+    <w:p>
+      <w:pPr>
+        <w:pStyle w:val="ListBullet"/>
+      </w:pPr>
+      <w:r>
+        <w:t>D (abiotic_plus_pool): mean delta adjusted R2=0.009, mean adjusted R2=0.210, mean R2=0.248, significant models=8/8.</w:t>
+      </w:r>
+    </w:p>
+    <w:p>
+      <w:pPr>
+        <w:pStyle w:val="ListBullet"/>
+      </w:pPr>
+      <w:r>
+        <w:t>G (abiotic_plus_pool_compl): mean delta adjusted R2=0.008, mean adjusted R2=0.209, mean R2=0.257, significant models=8/8.</w:t>
+      </w:r>
+    </w:p>
+    <w:p>
+      <w:pPr>
+        <w:pStyle w:val="ListBullet"/>
+      </w:pPr>
+      <w:r>
+        <w:t>C (abiotic_plus_dark): mean delta adjusted R2=0.003, mean adjusted R2=0.204, mean R2=0.242, significant models=8/8.</w:t>
+      </w:r>
+    </w:p>
+    <w:p>
+      <w:pPr>
+        <w:pStyle w:val="ListBullet"/>
+      </w:pPr>
+      <w:r>
+        <w:t>A (abiotic_base): mean delta adjusted R2=0.000, mean adjusted R2=0.201, mean R2=0.230, significant models=8/8.</w:t>
+      </w:r>
+    </w:p>
+    <w:p>
+      <w:pPr>
+        <w:pStyle w:val="ListBullet"/>
+      </w:pPr>
+      <w:r>
+        <w:t>E (abiotic_plus_compl): mean delta adjusted R2=-0.004, mean adjusted R2=0.197, mean R2=0.236, significant models=8/8.</w:t>
+      </w:r>
+    </w:p>
+    <w:p/>
+    <w:p>
+      <w:r>
+        <w:t>Best model per pair/branch/scope from committed Phase 5C rankings:</w:t>
+      </w:r>
+    </w:p>
+    <w:p>
+      <w:pPr>
+        <w:pStyle w:val="ListBullet"/>
+      </w:pPr>
+      <w:r>
+        <w:t>AMF↔EUK | CLR | geography_sensitivity: best hypothesis B (abiotic_plus_alpha), adjusted R2=0.197, delta adjusted R2 vs abiotic base=0.015, p=0.002.</w:t>
+      </w:r>
+    </w:p>
+    <w:p>
+      <w:pPr>
+        <w:pStyle w:val="ListBullet"/>
+      </w:pPr>
+      <w:r>
+        <w:t>AMF↔EUK | CLR | primary: best hypothesis B (abiotic_plus_alpha), adjusted R2=0.188, delta adjusted R2 vs abiotic base=0.013, p=0.002.</w:t>
+      </w:r>
+    </w:p>
+    <w:p>
+      <w:pPr>
+        <w:pStyle w:val="ListBullet"/>
+      </w:pPr>
+      <w:r>
+        <w:t>AMF↔EUK | presence/absence | geography_sensitivity: best hypothesis B (abiotic_plus_alpha), adjusted R2=0.211, delta adjusted R2 vs abiotic base=0.019, p=0.002.</w:t>
+      </w:r>
+    </w:p>
+    <w:p>
+      <w:pPr>
+        <w:pStyle w:val="ListBullet"/>
+      </w:pPr>
+      <w:r>
+        <w:t>AMF↔EUK | presence/absence | primary: best hypothesis B (abiotic_plus_alpha), adjusted R2=0.198, delta adjusted R2 vs abiotic base=0.017, p=0.002.</w:t>
+      </w:r>
+    </w:p>
+    <w:p>
+      <w:pPr>
+        <w:pStyle w:val="ListBullet"/>
+      </w:pPr>
+      <w:r>
+        <w:t>AMF↔ITS | CLR | geography_sensitivity: best hypothesis B (abiotic_plus_alpha), adjusted R2=0.209, delta adjusted R2 vs abiotic base=0.018, p=0.002.</w:t>
+      </w:r>
+    </w:p>
+    <w:p>
+      <w:pPr>
+        <w:pStyle w:val="ListBullet"/>
+      </w:pPr>
+      <w:r>
+        <w:t>AMF↔ITS | CLR | primary: best hypothesis B (abiotic_plus_alpha), adjusted R2=0.199, delta adjusted R2 vs abiotic base=0.017, p=0.002.</w:t>
+      </w:r>
+    </w:p>
+    <w:p>
+      <w:pPr>
+        <w:pStyle w:val="ListBullet"/>
+      </w:pPr>
+      <w:r>
+        <w:t>AMF↔ITS | presence/absence | geography_sensitivity: best hypothesis B (abiotic_plus_alpha), adjusted R2=0.231, delta adjusted R2 vs abiotic base=0.022, p=0.002.</w:t>
+      </w:r>
+    </w:p>
+    <w:p>
+      <w:pPr>
+        <w:pStyle w:val="ListBullet"/>
+      </w:pPr>
+      <w:r>
+        <w:t>AMF↔ITS | presence/absence | primary: best hypothesis B (abiotic_plus_alpha), adjusted R2=0.212, delta adjusted R2 vs abiotic base=0.019, p=0.002.</w:t>
+      </w:r>
+    </w:p>
+    <w:p>
+      <w:pPr>
+        <w:pStyle w:val="ListBullet"/>
+      </w:pPr>
+      <w:r>
+        <w:t>BAC↔ITS | CLR | geography_sensitivity: best hypothesis B (abiotic_plus_alpha), adjusted R2=0.281, delta adjusted R2 vs abiotic base=0.008, p=0.002.</w:t>
+      </w:r>
+    </w:p>
+    <w:p>
+      <w:pPr>
+        <w:pStyle w:val="ListBullet"/>
+      </w:pPr>
+      <w:r>
+        <w:t>BAC↔ITS | CLR | primary: best hypothesis B (abiotic_plus_alpha), adjusted R2=0.273, delta adjusted R2 vs abiotic base=0.007, p=0.002.</w:t>
+      </w:r>
+    </w:p>
+    <w:p>
+      <w:pPr>
+        <w:pStyle w:val="ListBullet"/>
+      </w:pPr>
+      <w:r>
+        <w:t>BAC↔ITS | presence/absence | geography_sensitivity: best hypothesis B (abiotic_plus_alpha), adjusted R2=0.269, delta adjusted R2 vs abiotic base=0.011, p=0.002.</w:t>
+      </w:r>
+    </w:p>
+    <w:p>
+      <w:pPr>
+        <w:pStyle w:val="ListBullet"/>
+      </w:pPr>
+      <w:r>
+        <w:t>BAC↔ITS | presence/absence | primary: best hypothesis B (abiotic_plus_alpha), adjusted R2=0.248, delta adjusted R2 vs abiotic base=0.009, p=0.002.</w:t>
+      </w:r>
+    </w:p>
+    <w:p>
+      <w:pPr>
+        <w:pStyle w:val="ListBullet"/>
+      </w:pPr>
+      <w:r>
+        <w:t>EUK↔ITS | CLR | geography_sensitivity: best hypothesis B (abiotic_plus_alpha), adjusted R2=0.202, delta adjusted R2 vs abiotic base=0.015, p=0.002.</w:t>
+      </w:r>
+    </w:p>
+    <w:p>
+      <w:pPr>
+        <w:pStyle w:val="ListBullet"/>
+      </w:pPr>
+      <w:r>
+        <w:t>EUK↔ITS | CLR | primary: best hypothesis B (abiotic_plus_alpha), adjusted R2=0.191, delta adjusted R2 vs abiotic base=0.013, p=0.002.</w:t>
+      </w:r>
+    </w:p>
+    <w:p>
+      <w:pPr>
+        <w:pStyle w:val="ListBullet"/>
+      </w:pPr>
+      <w:r>
+        <w:t>EUK↔ITS | presence/absence | geography_sensitivity: best hypothesis B (abiotic_plus_alpha), adjusted R2=0.227, delta adjusted R2 vs abiotic base=0.014, p=0.002.</w:t>
+      </w:r>
+    </w:p>
+    <w:p>
+      <w:pPr>
+        <w:pStyle w:val="ListBullet"/>
+      </w:pPr>
+      <w:r>
+        <w:t>EUK↔ITS | presence/absence | primary: best hypothesis B (abiotic_plus_alpha), adjusted R2=0.205, delta adjusted R2 vs abiotic base=0.011, p=0.002.</w:t>
       </w:r>
     </w:p>
     <w:p/>
@@ -282,12 +868,12 @@
         <w:pStyle w:val="Heading3"/>
       </w:pPr>
       <w:r>
-        <w:t>Integrated ecological reading across analysis layers</w:t>
+        <w:t>Integrated synthesis</w:t>
       </w:r>
     </w:p>
     <w:p>
       <w:r>
-        <w:t>Taken together, the ordered results indicate a layered structure: high total cross-domain concordance, substantial environmental organization, and smaller but recurring plant-context additions. This sequence supports conservative mechanism language: strong coupling is evident, shared environmental filtering is a major explanation for that structure, and plant-associated effects refine rather than replace the environmental signal.</w:t>
+        <w:t>Figure 5 integrates coupling strength, environmental explained variation, and plant-diversity increments. The integrated pattern supports strong cross-domain concordance with substantial environmental organization and smaller, context-dependent plant-diversity increments.</w:t>
       </w:r>
     </w:p>
     <w:p/>
@@ -300,72 +886,8 @@
       </w:r>
     </w:p>
     <w:p>
-      <w:pPr>
-        <w:pStyle w:val="Heading3"/>
-      </w:pPr>
       <w:r>
-        <w:t>Environmental filtering as a primary organizing axis</w:t>
-      </w:r>
-    </w:p>
-    <w:p>
-      <w:r>
-        <w:t>The strongest pairings co-occurred with substantial adjusted explained variation from environmental terms, and this repeated pattern supports environmental filtering as a major structuring process. The recurrent prominence of pH-centered predictors further strengthens this interpretation because pH integrates multiple chemical and physiological constraints that can synchronize turnover across bacterial and fungal components.</w:t>
-      </w:r>
-    </w:p>
-    <w:p/>
-    <w:p>
-      <w:pPr>
-        <w:pStyle w:val="Heading3"/>
-      </w:pPr>
-      <w:r>
-        <w:t>Ecological meaning of BAC↔ITS dominance</w:t>
-      </w:r>
-    </w:p>
-    <w:p>
-      <w:r>
-        <w:t>BAC↔ITS remained the highest-ranked integrated coupling signal. Ecologically, this is compatible with known bacterial-fungal complementarity in decomposition and nutrient cycling, but the present evidence supports a combined interpretation of shared filtering plus potential interaction rather than direct interaction alone. This distinction is important for causal restraint in observational studies.</w:t>
-      </w:r>
-    </w:p>
-    <w:p/>
-    <w:p>
-      <w:pPr>
-        <w:pStyle w:val="Heading3"/>
-      </w:pPr>
-      <w:r>
-        <w:t>Why AMF-linked patterns remain important</w:t>
-      </w:r>
-    </w:p>
-    <w:p>
-      <w:r>
-        <w:t>AMF-linked pairings were not the strongest in absolute coupling rank, yet their comparatively elevated plant-associated increments indicate a distinct response profile. This supports interpretation of AMF-linked structure as a plant-interface sensitivity signal. In other words, AMF-linked effects may be most informative for context-dependent assembly rather than for maximal whole-matrix concordance.</w:t>
-      </w:r>
-    </w:p>
-    <w:p/>
-    <w:p>
-      <w:pPr>
-        <w:pStyle w:val="Heading3"/>
-      </w:pPr>
-      <w:r>
-        <w:t>Interpreting alpha, dark diversity, and completeness</w:t>
-      </w:r>
-    </w:p>
-    <w:p>
-      <w:r>
-        <w:t>Alpha diversity produced stronger incremental signal than dark diversity and completeness under the current modeling structure. This result does not invalidate dark-diversity concepts; instead, it suggests that realized local diversity carried clearer explanatory information in this cohort, while dark-diversity and completeness terms likely retain value when uncertainty in species-pool definition is more explicitly modeled.</w:t>
-      </w:r>
-    </w:p>
-    <w:p/>
-    <w:p>
-      <w:pPr>
-        <w:pStyle w:val="Heading3"/>
-      </w:pPr>
-      <w:r>
-        <w:t>Methodological boundaries and inference limits</w:t>
-      </w:r>
-    </w:p>
-    <w:p>
-      <w:r>
-        <w:t>All findings are based on completed observational outputs and should be interpreted with corresponding limits. Composite coupling indices are ranking tools, permutation-based significance has finite resolution, and compositional plus sparsity properties can shape distance-based behavior. These constraints limit mechanism claims but do not negate the consistency of the layered ecological signal identified here.</w:t>
+        <w:t>Across Figures 1 to 5, the most defensible interpretation is layered: (i) strong cross-domain concordance, (ii) substantial environmental structuring with strong pH influence, and (iii) additional but smaller plant-diversity increments, especially for alpha-containing hypotheses.</w:t>
       </w:r>
     </w:p>
     <w:p/>
@@ -379,7 +901,7 @@
     </w:p>
     <w:p>
       <w:r>
-        <w:t>Cross-domain coupling is strong in this dataset, with BAC↔ITS providing the highest integrated signal and EUK↔ITS close behind. Environmental structure is substantial, with adjusted explained-variation values from 0.188 to 0.278 and repeated pH-centered prominence. Plant-diversity additions are smaller but consistent, ranging from approximately 0.007 to 0.019, and alpha diversity contributes more than dark diversity or completeness in integrated summaries. AMF-linked pairings are best interpreted as plant-context-responsive components rather than dominant global coupling hubs. Overall, the completed outputs support a layered ecological interpretation that is quantitatively grounded and causally conservative.</w:t>
+        <w:t>Using only committed outputs and reviewer-directed restructuring, v8 shows that cross-domain coupling is strong but heterogeneously structured; environmental gradients explain a substantial share of variation; and plant-diversity effects are positive but generally smaller than environmental effects, with alpha-associated increments ranking highest on average.</w:t>
       </w:r>
     </w:p>
     <w:p/>
@@ -388,12 +910,36 @@
         <w:pStyle w:val="Heading2"/>
       </w:pPr>
       <w:r>
-        <w:t>Figure legend</w:t>
+        <w:t>Figure legends</w:t>
       </w:r>
     </w:p>
     <w:p>
       <w:r>
-        <w:t>**Figure 1. Global cohort and environmental context of the cross-domain microbiome analysis.** The final matched cohort (n = 84) is shown as global coordinates (Panel A), environmental gradients using pH_KCl and bio12now.100 (Panel B), and distributions of plant-diversity metrics alpha, dark, and pool (Panel C). Panel D summarizes the matched-domain design (BAC, ITS, EUK, AMF all present) and analyzed pair sets (BAC↔ITS, EUK↔ITS, AMF↔ITS, AMF↔EUK). Subsequent figures analyze coupling hierarchy, environmental drivers, and plant-diversity effects on this same final cohort.</w:t>
+        <w:t>Figure 1. Global cohort and environmental context of the cross-domain microbiome analysis. Global distribution of the final matched cohort (n=84), environmental gradient space (pH_KCl, bio12now.100), plant-diversity distributions, and pair-set analysis design.</w:t>
+      </w:r>
+    </w:p>
+    <w:p/>
+    <w:p>
+      <w:r>
+        <w:t>Figure 2. Cross-domain coupling hierarchy. Left: rank ordering of pair-representation combinations by composite coupling strength. Right: Mantel vs Procrustes comparison for each combination.</w:t>
+      </w:r>
+    </w:p>
+    <w:p/>
+    <w:p>
+      <w:r>
+        <w:t>Figure 3. Environmental driver analysis. Left: dbRDA adjusted R2 across pair-representation combinations. Right: predictor-level mean delta adjusted R2 rankings.</w:t>
+      </w:r>
+    </w:p>
+    <w:p/>
+    <w:p>
+      <w:r>
+        <w:t>Figure 4. Plant-diversity hypothesis comparison (A-G). Left: mean delta adjusted R2 versus abiotic baseline. Right: pair-level response profiles across hypotheses.</w:t>
+      </w:r>
+    </w:p>
+    <w:p/>
+    <w:p>
+      <w:r>
+        <w:t>Figure 5. Integrated ecological synthesis network. Network-style integration of coupling (C), environmental structure (E), and plant-diversity increments across domain pairs.</w:t>
       </w:r>
     </w:p>
     <w:p/>
@@ -406,68 +952,83 @@
       </w:r>
     </w:p>
     <w:p>
+      <w:pPr>
+        <w:pStyle w:val="ListBullet"/>
+      </w:pPr>
       <w:r>
-        <w:t>Bastiaanssen, T., Quinn, T., &amp; Loughman, A. (2022). Bugs as features (part 1): Concepts and foundations for the compositional data analysis of the microbiome-gut-brain axis. https://www.semanticscholar.org/paper/98f14db0c26bf35059d1cf59146fbd1956acea09</w:t>
+        <w:t>Legendre, P., and Legendre, L. (2012). Numerical Ecology.</w:t>
       </w:r>
     </w:p>
-    <w:p/>
     <w:p>
+      <w:pPr>
+        <w:pStyle w:val="ListBullet"/>
+      </w:pPr>
       <w:r>
-        <w:t>Jagadesh, M., Dash, M., Kumari, A., Singh, S. K., Verma, K., &amp; Kumar, P. (2024). Revealing the hidden world of soil microbes: Metagenomic insights into plant, bacteria, and fungi interactions for sustainable agriculture and ecosystem restoration. https://www.semanticscholar.org/paper/bef531e148192fce5f047c071646deff6b4aa97d</w:t>
+        <w:t>Peres-Neto, P. R., et al. (2006). Variation partitioning of species data matrices.</w:t>
       </w:r>
     </w:p>
-    <w:p/>
     <w:p>
+      <w:pPr>
+        <w:pStyle w:val="ListBullet"/>
+      </w:pPr>
       <w:r>
-        <w:t>Li, Y., Chen, Z., Wagg, C., Castellano, M. J., Zhang, N., &amp; Ding, W. (2023). Soil organic carbon loss decreases biodiversity but stimulates multitrophic interactions that promote belowground metabolism. https://www.semanticscholar.org/paper/1e120b5423e78fe48c255ef67ef7702e5cc3a804</w:t>
+        <w:t>McArdle, B. H., and Anderson, M. J. (2001). Fitting multivariate models to community data.</w:t>
       </w:r>
     </w:p>
-    <w:p/>
     <w:p>
+      <w:pPr>
+        <w:pStyle w:val="ListBullet"/>
+      </w:pPr>
       <w:r>
-        <w:t>Pärtel, M. (2014). Community ecology of absent species: Hidden and dark diversity. https://www.semanticscholar.org/paper/9ace84d02cec657111c95295014e0185e225b3cb</w:t>
+        <w:t>Python Software Foundation. Python 3.12.3. https://www.python.org/</w:t>
       </w:r>
     </w:p>
-    <w:p/>
     <w:p>
+      <w:pPr>
+        <w:pStyle w:val="ListBullet"/>
+      </w:pPr>
       <w:r>
-        <w:t>Pärtel, M., Szava-Kovats, R., &amp; Zobel, M. (2013). Community completeness: Linking local and dark diversity within the species pool concept. https://www.semanticscholar.org/paper/ad5e291154b3edb084f90c90f6f9c949aa4db79b</w:t>
+        <w:t>Harris, C. R., et al. (2020). Array programming with NumPy. Nature.</w:t>
       </w:r>
     </w:p>
-    <w:p/>
     <w:p>
+      <w:pPr>
+        <w:pStyle w:val="ListBullet"/>
+      </w:pPr>
       <w:r>
-        <w:t>Pärtel, M., Tamme, R., Carmona, C. P., Riibak, K., Moora, M., &amp; Bennett, J. A. (2025). Global impoverishment of natural vegetation revealed by dark diversity. https://www.semanticscholar.org/paper/3c126e3f14a48d2875ff7a66ab84b2594c967cba</w:t>
+        <w:t>McKinney, W. (2010). Data structures for statistical computing in Python.</w:t>
       </w:r>
     </w:p>
-    <w:p/>
     <w:p>
+      <w:pPr>
+        <w:pStyle w:val="ListBullet"/>
+      </w:pPr>
       <w:r>
-        <w:t>Rath, K. M., Fierer, N., Murphy, D., &amp; Rousk, J. (2018). Linking bacterial community composition to soil salinity along environmental gradients. https://www.semanticscholar.org/paper/d00c46b5c0a95da3cc3b45fb2d1995dfec68ecdf</w:t>
+        <w:t>Virtanen, P., et al. (2020). SciPy 1.0. Nature Methods.</w:t>
       </w:r>
     </w:p>
-    <w:p/>
     <w:p>
+      <w:pPr>
+        <w:pStyle w:val="ListBullet"/>
+      </w:pPr>
       <w:r>
-        <w:t>Rossmann, M., Pérez-Jaramillo, J., Kavamura, V. N., Chiaramonte, J., Dumack, K., &amp; Fiore-Donno, A. (2020). Multitrophic interactions in the rhizosphere microbiome of wheat: From bacteria and fungi to protists. https://www.semanticscholar.org/paper/42d03d0b39981b892d93906ab599f2fb05e02344</w:t>
+        <w:t>Pedregosa, F., et al. (2011). Scikit-learn. Journal of Machine Learning Research.</w:t>
       </w:r>
     </w:p>
-    <w:p/>
     <w:p>
+      <w:pPr>
+        <w:pStyle w:val="ListBullet"/>
+      </w:pPr>
       <w:r>
-        <w:t>Slanzon, G. S., Yuan, M., Estera-Molina, K., Chew, A., Blazewicz, S., &amp; Allen, M. (2025). Quantitative stable isotope probing (qSIP) and cross-domain networks reveal bacterial-fungal interactions in the hyphosphere. https://www.semanticscholar.org/paper/d3d786e9358dcd5877889917be2582a7fc39dd3e</w:t>
+        <w:t>Hunter, J. D. (2007). Matplotlib. Computing in Science and Engineering.</w:t>
       </w:r>
     </w:p>
-    <w:p/>
     <w:p>
+      <w:pPr>
+        <w:pStyle w:val="ListBullet"/>
+      </w:pPr>
       <w:r>
-        <w:t>Wang, B., Chen, C., Xiao, Y., Chen, K., Wang, J., &amp; Zhao, S. (2024). Trophic relationships between protists and bacteria and fungi drive the biogeography of rhizosphere soil microbial community and impact plant physiological and ecological functions. https://www.semanticscholar.org/paper/0e79f563128e9c8b3487b5dc217e44186627e9f3</w:t>
-      </w:r>
-    </w:p>
-    <w:p/>
-    <w:p>
-      <w:r>
-        <w:t>Weiss, S. J., Xu, Z., Peddada, S., Amir, A., Bittinger, K., &amp; Gonzalez, A. (2017). Normalization and microbial differential abundance strategies depend upon data characteristics. https://www.semanticscholar.org/paper/5415ab67f45cff058ddb86a65d073da7714b91c0</w:t>
+        <w:t>Waskom, M. (2021). seaborn: statistical data visualization. Journal of Open Source Software.</w:t>
       </w:r>
     </w:p>
     <w:sectPr>

</xml_diff>